<commit_message>
Começar o EDA. Continuar o enriquecimento do dataset com dados meteorológicos. Faltou passar os dados para csv e juntar todos os csvs num só.
</commit_message>
<xml_diff>
--- a/ProgressReport_HenriqueCura.docx
+++ b/ProgressReport_HenriqueCura.docx
@@ -395,76 +395,41 @@
     <w:p>
       <w:pPr>
         <w:pStyle w:val="Text"/>
-      </w:pPr>
-      <w:r>
-        <w:t xml:space="preserve">The </w:t>
-      </w:r>
-      <w:r>
-        <w:rPr>
-          <w:i/>
-        </w:rPr>
-        <w:t>IJCAI–2</w:t>
-      </w:r>
-      <w:r>
-        <w:rPr>
-          <w:rFonts w:hint="eastAsia"/>
-          <w:i/>
-          <w:lang w:eastAsia="zh-CN"/>
-        </w:rPr>
-        <w:t>5</w:t>
-      </w:r>
-      <w:r>
-        <w:rPr>
-          <w:i/>
-        </w:rPr>
-        <w:t xml:space="preserve"> Proceedings</w:t>
-      </w:r>
-      <w:r>
-        <w:t xml:space="preserve"> will be printed from electronic manuscripts submitted by the authors. These must be PDF (</w:t>
-      </w:r>
-      <w:r>
-        <w:rPr>
-          <w:i/>
-        </w:rPr>
-        <w:t>Portable Document Format</w:t>
-      </w:r>
-      <w:r>
-        <w:t>) files formatted for 8-1/2</w:t>
-      </w:r>
-      <w:r>
-        <w:rPr>
-          <w:i/>
-        </w:rPr>
-        <w:t>"</w:t>
-      </w:r>
-      <w:r>
+        <w:rPr>
+          <w:lang w:val="pt-PT"/>
+        </w:rPr>
+      </w:pPr>
+      <w:r>
+        <w:rPr>
+          <w:lang w:val="pt-PT"/>
+        </w:rPr>
+        <w:t xml:space="preserve">A produção, distribuição e </w:t>
+      </w:r>
+      <w:r>
+        <w:rPr>
+          <w:lang w:val="pt-PT"/>
+        </w:rPr>
+        <w:t xml:space="preserve">os  de preços de energia são temas complexos mas que merecem ser estudados de forma a obter conhecimento e a perceber como os diferentes fatores influenciam ou se correlacionam com estas variações. A relevância do estudo da energia tomou ainda maior ênfase depois das disrupções que ocorreram ao longo deste ultimo mês de fevereiro (de 2026) e do apagão generalizado que ocorreu em território nacional e ibérico no passado mês de abril (de 2025). Estes eventos relembraram a todos os portugueses o impacto que estas falhas na distribuição de energia têm no quotidiano das pessoas e daí a importância desta área de estudo para além de estudar o que leva </w:t>
+      </w:r>
+      <w:r>
+        <w:rPr>
+          <w:lang w:val="pt-PT"/>
+        </w:rPr>
+        <w:t xml:space="preserve">aos preços mais baixos, num país como o nosso que tem dos preços energéticos mais competitivos da União Europeia. </w:t>
+      </w:r>
+      <w:r>
+        <w:rPr>
+          <w:lang w:val="pt-PT"/>
+        </w:rPr>
         <w:t xml:space="preserve"> </w:t>
       </w:r>
-      <w:r>
-        <w:rPr>
-          <w:rFonts w:ascii="Symbol" w:hAnsi="Symbol" w:cs="Symbol"/>
-        </w:rPr>
-        <w:t></w:t>
-      </w:r>
-      <w:r>
-        <w:t xml:space="preserve"> 11</w:t>
-      </w:r>
-      <w:r>
-        <w:rPr>
-          <w:i/>
-        </w:rPr>
-        <w:t>"</w:t>
-      </w:r>
-      <w:r>
-        <w:t xml:space="preserve"> paper.</w:t>
-      </w:r>
-      <w:r>
-        <w:t xml:space="preserve"> </w:t>
-      </w:r>
-    </w:p>
-    <w:p>
-      <w:pPr>
-        <w:pStyle w:val="Text"/>
+    </w:p>
+    <w:p>
+      <w:pPr>
+        <w:pStyle w:val="Text"/>
+        <w:rPr>
+          <w:lang w:val="pt-PT"/>
+        </w:rPr>
       </w:pPr>
     </w:p>
     <w:p>
@@ -631,7 +596,19 @@
         <w:rPr>
           <w:lang w:val="pt-PT"/>
         </w:rPr>
-        <w:t>E-REDES – Distribuição de eletricidade, “Portal Open Data E-REDES”. Acedido em “Data”. [Online] Disponível em </w:t>
+        <w:t xml:space="preserve">E-REDES – Distribuição de eletricidade, “Portal Open Data E-REDES”. Acedido em </w:t>
+      </w:r>
+      <w:r>
+        <w:rPr>
+          <w:lang w:val="pt-PT"/>
+        </w:rPr>
+        <w:t>24/02/2026</w:t>
+      </w:r>
+      <w:r>
+        <w:rPr>
+          <w:lang w:val="pt-PT"/>
+        </w:rPr>
+        <w:t>. [Online] Disponível em </w:t>
       </w:r>
       <w:hyperlink r:id="rId10" w:tgtFrame="_blank" w:tooltip="https://e-redes.opendatasoft.com/pages/homepage/" w:history="1">
         <w:r>
@@ -937,7 +914,11 @@
         <w:ind w:firstLine="202"/>
       </w:pPr>
       <w:r>
-        <w:t>If your paper is accepted, please carefully read the notifications you receive, and check the proceedings submission information</w:t>
+        <w:t xml:space="preserve">If your paper is accepted, please carefully read the notifications you receive, and check the proceedings submission </w:t>
+      </w:r>
+      <w:r>
+        <w:lastRenderedPageBreak/>
+        <w:t>information</w:t>
       </w:r>
       <w:r>
         <w:rPr>
@@ -1011,11 +992,7 @@
         <w:t>E</w:t>
       </w:r>
       <w:r>
-        <w:t xml:space="preserve">X macros and a Microsoft Word template for use in </w:t>
-      </w:r>
-      <w:r>
-        <w:lastRenderedPageBreak/>
-        <w:t>formatting your paper.</w:t>
+        <w:t>X macros and a Microsoft Word template for use in formatting your paper.</w:t>
       </w:r>
       <w:r>
         <w:t xml:space="preserve"> IJCAI recommends using </w:t>
@@ -1277,11 +1254,7 @@
         <w:t></w:t>
       </w:r>
       <w:r>
-        <w:t xml:space="preserve"> </w:t>
-      </w:r>
-      <w:proofErr w:type="gramStart"/>
-      <w:r>
-        <w:t>11</w:t>
+        <w:t xml:space="preserve"> 11</w:t>
       </w:r>
       <w:r>
         <w:rPr>
@@ -1290,11 +1263,7 @@
         <w:t>"</w:t>
       </w:r>
       <w:r>
-        <w:t xml:space="preserve"> page</w:t>
-      </w:r>
-      <w:proofErr w:type="gramEnd"/>
-      <w:r>
-        <w:t xml:space="preserve"> size. For A4-size paper, use the given top and left margins, column width, height, and gap, and modify the bottom and right margins as necessary.</w:t>
+        <w:t xml:space="preserve"> page size. For A4-size paper, use the given top and left margins, column width, height, and gap, and modify the bottom and right margins as necessary.</w:t>
       </w:r>
     </w:p>
     <w:p>
@@ -1413,7 +1382,6 @@
         <w:t>\</w:t>
       </w:r>
       <w:proofErr w:type="spellStart"/>
-      <w:proofErr w:type="gramStart"/>
       <w:r>
         <w:rPr>
           <w:rFonts w:ascii="Courier New" w:hAnsi="Courier New" w:cs="Courier New"/>
@@ -1421,7 +1389,6 @@
         <w:t>usepackage</w:t>
       </w:r>
       <w:proofErr w:type="spellEnd"/>
-      <w:proofErr w:type="gramEnd"/>
       <w:r>
         <w:rPr>
           <w:rFonts w:ascii="Courier New" w:hAnsi="Courier New" w:cs="Courier New"/>
@@ -1556,10 +1523,7 @@
         <w:pStyle w:val="Text"/>
       </w:pPr>
       <w:r>
-        <w:t>In this document, we distinguish between papers submitted for review (henceforth, submissions) and camera-ready versions, i.e., accepted papers that will be included in the conference proceedings. The present document provides infor</w:t>
-      </w:r>
-      <w:r>
-        <w:t>mation to be used by both types of papers (submissions / camera-ready). There are relevant differences between the two versions. Find them next.</w:t>
+        <w:t>In this document, we distinguish between papers submitted for review (henceforth, submissions) and camera-ready versions, i.e., accepted papers that will be included in the conference proceedings. The present document provides information to be used by both types of papers (submissions / camera-ready). There are relevant differences between the two versions. Find them next.</w:t>
       </w:r>
     </w:p>
     <w:p>
@@ -1800,6 +1764,7 @@
           <w:rFonts w:hint="eastAsia"/>
           <w:lang w:eastAsia="zh-CN"/>
         </w:rPr>
+        <w:lastRenderedPageBreak/>
         <w:t>Author Name</w:t>
       </w:r>
       <w:r>
@@ -1858,7 +1823,6 @@
         </w:rPr>
         <w:t>“</w:t>
       </w:r>
-      <w:proofErr w:type="gramStart"/>
       <w:r>
         <w:rPr>
           <w:rFonts w:hint="eastAsia"/>
@@ -1884,15 +1848,7 @@
           <w:rFonts w:hint="eastAsia"/>
           <w:lang w:eastAsia="zh-CN"/>
         </w:rPr>
-        <w:t xml:space="preserve">  for</w:t>
-      </w:r>
-      <w:proofErr w:type="gramEnd"/>
-      <w:r>
-        <w:rPr>
-          <w:rFonts w:hint="eastAsia"/>
-          <w:lang w:eastAsia="zh-CN"/>
-        </w:rPr>
-        <w:t xml:space="preserve"> the second to last author. </w:t>
+        <w:t xml:space="preserve">  for the second to last author. </w:t>
       </w:r>
     </w:p>
     <w:p>
@@ -1946,7 +1902,6 @@
           <w:rFonts w:hint="eastAsia"/>
           <w:lang w:eastAsia="zh-CN"/>
         </w:rPr>
-        <w:lastRenderedPageBreak/>
         <w:t>Affiliation</w:t>
       </w:r>
       <w:r>
@@ -2057,21 +2012,7 @@
         <w:rPr>
           <w:lang w:eastAsia="zh-CN"/>
         </w:rPr>
-        <w:t xml:space="preserve">In these </w:t>
-      </w:r>
-      <w:proofErr w:type="gramStart"/>
-      <w:r>
-        <w:rPr>
-          <w:lang w:eastAsia="zh-CN"/>
-        </w:rPr>
-        <w:t>situations</w:t>
-      </w:r>
-      <w:proofErr w:type="gramEnd"/>
-      <w:r>
-        <w:rPr>
-          <w:lang w:eastAsia="zh-CN"/>
-        </w:rPr>
-        <w:t xml:space="preserve"> you don’t need to do anything special.</w:t>
+        <w:t>In these situations you don’t need to do anything special.</w:t>
       </w:r>
     </w:p>
     <w:p>
@@ -2510,7 +2451,10 @@
         <w:t>''</w:t>
       </w:r>
       <w:r>
-        <w:t xml:space="preserve"> from the top of the page, unless that does not leave enough room for the title and author information. Use a slightly smaller width than in the body of the paper. Head the abstract with “Abstract” centered above the body of the abstract in a 12-point bold font. The body of the abstract should be in the same font as the body of the paper.</w:t>
+        <w:t xml:space="preserve"> from the top of the page, unless that does not leave enough room for the title and author information. Use a slightly smaller </w:t>
+      </w:r>
+      <w:r>
+        <w:t>width than in the body of the paper. Head the abstract with “Abstract” centered above the body of the abstract in a 12-point bold font. The body of the abstract should be in the same font as the body of the paper.</w:t>
       </w:r>
     </w:p>
     <w:p>
@@ -2519,10 +2463,7 @@
       </w:pPr>
       <w:r>
         <w:tab/>
-        <w:t xml:space="preserve">The abstract should be a concise, one-paragraph summary describing the general thesis and conclusion of your paper. A </w:t>
-      </w:r>
-      <w:r>
-        <w:t>reader should be able to learn the purpose of the paper and the reason for its importance from the abstract. The abstract should be no more than 200 words long.</w:t>
+        <w:t>The abstract should be a concise, one-paragraph summary describing the general thesis and conclusion of your paper. A reader should be able to learn the purpose of the paper and the reason for its importance from the abstract. The abstract should be no more than 200 words long.</w:t>
       </w:r>
     </w:p>
     <w:p>
@@ -2701,7 +2642,11 @@
         <w:pStyle w:val="Text"/>
       </w:pPr>
       <w:r>
-        <w:t xml:space="preserve">You may move some of the contents of the paper into one or more appendices that appear after the main content, but before references. These appendices count towards the page limit and are distinct from the supplementary material that can be submitted separately through CMT. Such appendices are useful if you would like to include highly technical material (such as a lengthy calculation) that will disrupt the flow of the paper. They can be included both in papers submitted for review and in camera-ready versions; in the latter case, they will be included in the proceedings (whereas the supplementary materials will not be included in the proceedings). </w:t>
+        <w:t xml:space="preserve">You may move some of the contents of the paper into one or more appendices that appear after the main content, but before references. These appendices count towards the page limit and are distinct from the supplementary material that can be submitted separately through CMT. Such appendices are useful if you would like to include highly technical material (such as a lengthy calculation) that will disrupt the flow of the paper. They can be included both in papers submitted for review and in camera-ready versions; in the latter case, </w:t>
+      </w:r>
+      <w:r>
+        <w:lastRenderedPageBreak/>
+        <w:t xml:space="preserve">they will be included in the proceedings (whereas the supplementary materials will not be included in the proceedings). </w:t>
       </w:r>
       <w:r>
         <w:t>Appendices are optional. Appendices must appear after the main</w:t>
@@ -2724,7 +2669,6 @@
         <w:pStyle w:val="HeadingSubsubsection"/>
       </w:pPr>
       <w:r>
-        <w:lastRenderedPageBreak/>
         <w:t>Ethical Statement</w:t>
       </w:r>
     </w:p>
@@ -4355,7 +4299,11 @@
         <w:ind w:firstLine="202"/>
       </w:pPr>
       <w:r>
-        <w:t>It is encouraged to use the format shown in Table 1, where there are no vertical lines and only three horizontal ones: Two thi</w:t>
+        <w:t xml:space="preserve">It is encouraged to use the format shown in Table 1, where there are no vertical lines and only three horizontal ones: Two </w:t>
+      </w:r>
+      <w:r>
+        <w:lastRenderedPageBreak/>
+        <w:t>thi</w:t>
       </w:r>
       <w:r>
         <w:t>ck lines (1 ½ points) on top and bottom of the table and one thin l</w:t>
@@ -4370,7 +4318,6 @@
         <w:ind w:firstLine="202"/>
       </w:pPr>
       <w:r>
-        <w:lastRenderedPageBreak/>
         <w:t>Notice also that n</w:t>
       </w:r>
       <w:r>
@@ -6699,11 +6646,7 @@
         <w:t>5</w:t>
       </w:r>
       <w:r>
-        <w:t xml:space="preserve"> can be obtained by </w:t>
-      </w:r>
-      <w:proofErr w:type="gramStart"/>
-      <w:r>
-        <w:t xml:space="preserve">contacting </w:t>
+        <w:t xml:space="preserve"> can be obtained by contacting </w:t>
       </w:r>
       <w:r>
         <w:rPr>
@@ -6731,7 +6674,6 @@
         </w:rPr>
         <w:t>rg</w:t>
       </w:r>
-      <w:proofErr w:type="gramEnd"/>
       <w:r>
         <w:t>.</w:t>
       </w:r>

</xml_diff>